<commit_message>
Emílio Santiago: revisão parte 5
Co-Authored-By: Claude Opus 5.5 <noreply@anthropic.com>
Claude-Session: https://claude.ai/code/session_01MJjUEEZrxQDEUifKK2vj9g
</commit_message>
<xml_diff>
--- a/roteiros/emilio-santiago/EmilioSantiago_Parte5.docx
+++ b/roteiros/emilio-santiago/EmilioSantiago_Parte5.docx
@@ -71,7 +71,7 @@
         <w:rPr>
           <w:color w:val="000000"/>
         </w:rPr>
-        <w:t>O homem que perdeu a mãe num vinte de março, que descobriu a história aos vinte e seis anos, que levou os filhos ao velório e foi mal recebido, que teve um AVC dois dias depois da morte do cantor, que abriu uma vaquinha para pagar a exumação. Ele tinha mandado abrir o túmulo de um homem que, segundo o laudo, não tinha nenhuma ligação de sangue com ele.</w:t>
+        <w:t>O homem que perdeu a mãe num vinte de março, que descobriu a história aos vinte e seis anos, que levou os filhos ao velório e, segundo ele, foi humilhado, que foi parar numa UTI dois dias depois da morte do cantor, que abriu uma vaquinha para pagar a exumação. Ele tinha mandado abrir o túmulo de um homem que, segundo o laudo, não tinha nenhuma ligação de sangue com ele.</w:t>
       </w:r>
     </w:p>
     <w:p>
@@ -119,7 +119,7 @@
         <w:rPr>
           <w:color w:val="000000"/>
         </w:rPr>
-        <w:t>Para quem estava de fora, a cena era quase impossível de acreditar. Um dos cantores mais elegantes do Brasil, que passou a vida protegendo a própria intimidade, tinha virado tema de laudos genéticos e impugnações.</w:t>
+        <w:t>Um dos cantores mais elegantes do Brasil, que passou a vida protegendo a própria intimidade, tinha virado tema de laudos genéticos e impugnações.</w:t>
       </w:r>
     </w:p>
     <w:p>
@@ -191,7 +191,7 @@
         <w:rPr>
           <w:color w:val="000000"/>
         </w:rPr>
-        <w:t>Durante a vida, aquela escolha protegeu o segredo dele. Depois da morte, deixou o homem que dividiu a casa com ele durante dezoito anos sem nenhum documento na mão. Márcio precisou ir à Justiça e convencer um juiz de que aquele amor tinha existido.</w:t>
+        <w:t>Durante a vida, aquela escolha protegeu o segredo dele. Depois da morte, deixou o homem que, segundo o próprio Márcio, dividiu a casa com ele durante dezoito anos sem nenhum documento na mão. Márcio precisou ir à Justiça e convencer um juiz de que aquele amor tinha existido.</w:t>
       </w:r>
     </w:p>
     <w:p>
@@ -199,7 +199,7 @@
         <w:rPr>
           <w:color w:val="000000"/>
         </w:rPr>
-        <w:t>A frase que Emílio disse para se defender virou a descrição exata da guerra que começou no dia seguinte ao enterro dele.</w:t>
+        <w:t>A frase que Emílio disse para se defender virou a descrição exata da guerra que começou logo depois do enterro dele.</w:t>
       </w:r>
     </w:p>
     <w:p>
@@ -215,7 +215,7 @@
         <w:rPr>
           <w:color w:val="000000"/>
         </w:rPr>
-        <w:t>Esse é o segredo repugnante que só apareceu depois da morte. O silêncio de um homem virou, depois do enterro, uma disputa suja entre pessoas que diziam amá-lo ou carregar o sangue dele.</w:t>
+        <w:t>Esse é o segredo que só apareceu depois da morte. E o que veio junto com ele foi repugnante. O silêncio de um homem virou uma disputa suja entre pessoas que diziam amá-lo ou carregar o sangue dele.</w:t>
       </w:r>
     </w:p>
     <w:p>
@@ -247,7 +247,7 @@
         <w:rPr>
           <w:color w:val="000000"/>
         </w:rPr>
-        <w:t>O disco "Aquarela Brasileira", que levou a voz dele a milhões de casas e construiu os dez milhões de reais que viraram motivo de guerra.</w:t>
+        <w:t>O disco "Aquarela Brasileira", que levou a voz dele a milhões de casas e ajudou a construir os dez milhões de reais que viraram motivo de guerra.</w:t>
       </w:r>
     </w:p>
     <w:p>

</xml_diff>